<commit_message>
Changes to master resume.
</commit_message>
<xml_diff>
--- a/Caleb Miller Master Resume.docx
+++ b/Caleb Miller Master Resume.docx
@@ -226,22 +226,7 @@
         </w:rPr>
       </w:pPr>
       <w:r>
-        <w:t xml:space="preserve">Troubleshot </w:t>
-      </w:r>
-      <w:r>
-        <w:t>WordPress and WooCommerce as production application platform</w:t>
-      </w:r>
-      <w:r>
-        <w:t>s</w:t>
-      </w:r>
-      <w:r>
-        <w:t>,</w:t>
-      </w:r>
-      <w:r>
-        <w:t xml:space="preserve"> resolving</w:t>
-      </w:r>
-      <w:r>
-        <w:t xml:space="preserve"> plugin behavior, release changes, configuration issues, and customer-facing application problems.</w:t>
+        <w:t>Developed and troubleshoot WordPress websites, developing custom E-commerce workflows, resolving plugin behavior, fixing configuration issues, and communicating with clients to resolve business needs.</w:t>
       </w:r>
     </w:p>
     <w:p>
@@ -1013,13 +998,7 @@
         <w:t>Grafana dashboards</w:t>
       </w:r>
       <w:r>
-        <w:t xml:space="preserve"> for a customer using Apica’s custom Grafana integration, leveraging Apica’s SaaS portal as a metrics data</w:t>
-      </w:r>
-      <w:r>
-        <w:t xml:space="preserve"> </w:t>
-      </w:r>
-      <w:r>
-        <w:t>source, improving observability and actionable insights for the customer.</w:t>
+        <w:t xml:space="preserve"> for a customer using Apica’s custom Grafana integration, leveraging Apica’s SaaS portal as a metrics data source, improving observability and actionable insights for the customer.</w:t>
       </w:r>
       <w:r>
         <w:rPr>

</xml_diff>

<commit_message>
add cover letter generation (beta)
</commit_message>
<xml_diff>
--- a/Caleb Miller Master Resume.docx
+++ b/Caleb Miller Master Resume.docx
@@ -326,13 +326,15 @@
     </w:p>
     <w:p>
       <w:pPr>
-        <w:pStyle w:val="Heading2"/>
-        <w:rPr>
-          <w:b w:val="0"/>
-          <w:bCs/>
-          <w:szCs w:val="20"/>
-        </w:rPr>
-      </w:pPr>
+        <w:pStyle w:val="ListParagraph"/>
+        <w:numPr>
+          <w:ilvl w:val="0"/>
+          <w:numId w:val="12"/>
+        </w:numPr>
+      </w:pPr>
+      <w:r>
+        <w:t>Diagnosed and resolved performance issues by comparing hosting telemetry, WordPress and PHP logs, WP-CLI output, and database activity, isolating stale WooCommerce Action Scheduler data as the cause of repeated CPU-heavy background processing.</w:t>
+      </w:r>
     </w:p>
     <w:p>
       <w:pPr>
@@ -347,6 +349,7 @@
           <w:sz w:val="21"/>
           <w:szCs w:val="24"/>
         </w:rPr>
+        <w:lastRenderedPageBreak/>
         <w:t>Founder &amp; Lead Developer</w:t>
       </w:r>
     </w:p>
@@ -561,7 +564,6 @@
           <w:sz w:val="20"/>
           <w:szCs w:val="24"/>
         </w:rPr>
-        <w:lastRenderedPageBreak/>
         <w:t>Architected and maintained a commercial WooCommerce extension for subscription changes and box configuration, owning business logic, debugging, testing, and release validation across live environments.</w:t>
       </w:r>
     </w:p>
@@ -987,6 +989,7 @@
         </w:numPr>
       </w:pPr>
       <w:r>
+        <w:lastRenderedPageBreak/>
         <w:t xml:space="preserve">Configured </w:t>
       </w:r>
       <w:r>
@@ -1196,7 +1199,6 @@
           <w:sz w:val="20"/>
           <w:szCs w:val="20"/>
         </w:rPr>
-        <w:lastRenderedPageBreak/>
         <w:t>Utilized</w:t>
       </w:r>
       <w:r>
@@ -1434,16 +1436,22 @@
       <w:pPr>
         <w:pStyle w:val="ListBullet"/>
         <w:rPr>
+          <w:sz w:val="22"/>
+        </w:rPr>
+      </w:pPr>
+      <w:r>
+        <w:rPr>
           <w:sz w:val="20"/>
           <w:szCs w:val="20"/>
         </w:rPr>
-      </w:pPr>
+        <w:t>C</w:t>
+      </w:r>
       <w:r>
         <w:rPr>
           <w:sz w:val="20"/>
           <w:szCs w:val="20"/>
         </w:rPr>
-        <w:t>Supported Windows Server application environments including Event Viewer review, SSL/TLS certificate setup, service configuration, and deployment troubleshooting.</w:t>
+        <w:t>ollaborated between internal Engineering teams and customers using Slack, Zendesk, and E-mail.</w:t>
       </w:r>
     </w:p>
     <w:p>
@@ -1459,7 +1467,7 @@
           <w:sz w:val="20"/>
           <w:szCs w:val="20"/>
         </w:rPr>
-        <w:t>Participated in 24/7 on-call rotation and maintained troubleshooting documentation used by the global support team.</w:t>
+        <w:t>Supported Windows Server application environments including Event Viewer review, SSL/TLS certificate setup, service configuration, and deployment troubleshooting.</w:t>
       </w:r>
     </w:p>
     <w:p>
@@ -1467,15 +1475,15 @@
         <w:pStyle w:val="ListBullet"/>
         <w:rPr>
           <w:sz w:val="20"/>
-          <w:szCs w:val="24"/>
+          <w:szCs w:val="20"/>
         </w:rPr>
       </w:pPr>
       <w:r>
         <w:rPr>
           <w:sz w:val="20"/>
-          <w:szCs w:val="24"/>
-        </w:rPr>
-        <w:t>Rewrote software agent installation documentation, contributing to roughly 20% faster implementation times.</w:t>
+          <w:szCs w:val="20"/>
+        </w:rPr>
+        <w:t>Participated in 24/7 on-call rotation and maintained troubleshooting documentation used by the global support team.</w:t>
       </w:r>
     </w:p>
     <w:p>
@@ -1492,7 +1500,33 @@
           <w:sz w:val="20"/>
           <w:szCs w:val="24"/>
         </w:rPr>
-        <w:t>Developed a Node.js application which created a custom marketing E-mail list by pulling customer data from the Zendesk API, filtering out irrelevant data, and converting it into an Excel file.</w:t>
+        <w:t>Rewrote software agent installation documentation in Confluence, improving clarity for customer implementations and contributing to roughly 20% faster implementation times.</w:t>
+      </w:r>
+    </w:p>
+    <w:p>
+      <w:pPr>
+        <w:pStyle w:val="ListBullet"/>
+        <w:rPr>
+          <w:sz w:val="20"/>
+          <w:szCs w:val="24"/>
+          <w:lang w:val="en-IN"/>
+        </w:rPr>
+      </w:pPr>
+      <w:proofErr w:type="spellStart"/>
+      <w:r>
+        <w:rPr>
+          <w:sz w:val="20"/>
+          <w:szCs w:val="24"/>
+        </w:rPr>
+        <w:t>Develope</w:t>
+      </w:r>
+      <w:proofErr w:type="spellEnd"/>
+      <w:r>
+        <w:rPr>
+          <w:sz w:val="20"/>
+          <w:szCs w:val="24"/>
+        </w:rPr>
+        <w:t>d a Node.js application which created a custom marketing E-mail list by pulling customer data from the Zendesk API, filtering out irrelevant data, and converting it into an Excel file.</w:t>
       </w:r>
     </w:p>
     <w:p>
@@ -2035,7 +2069,6 @@
         <w:pStyle w:val="Heading1"/>
       </w:pPr>
       <w:r>
-        <w:lastRenderedPageBreak/>
         <w:t>EDUCATION</w:t>
       </w:r>
     </w:p>
@@ -4533,7 +4566,6 @@
   <w:style w:type="character" w:default="1" w:styleId="DefaultParagraphFont">
     <w:name w:val="Default Paragraph Font"/>
     <w:uiPriority w:val="1"/>
-    <w:semiHidden/>
     <w:unhideWhenUsed/>
   </w:style>
   <w:style w:type="table" w:default="1" w:styleId="TableNormal">

</xml_diff>

<commit_message>
add "avoid" clause in skills strategy section explicilty stating to avoid buzzwords
</commit_message>
<xml_diff>
--- a/Caleb Miller Master Resume.docx
+++ b/Caleb Miller Master Resume.docx
@@ -130,6 +130,9 @@
         <w:t xml:space="preserve"> coordination, JIRA, Confluence, Okta, Zendesk</w:t>
       </w:r>
       <w:r>
+        <w:t>, Salesforce</w:t>
+      </w:r>
+      <w:r>
         <w:br/>
       </w:r>
       <w:r>
@@ -159,7 +162,22 @@
         <w:t xml:space="preserve">AWS, GCP, </w:t>
       </w:r>
       <w:r>
-        <w:t>Apica Synthetic Monitoring, Apica Load Testing, OpenTelemetry, Grafana, Graylog, ZebraTester, Selenium IDE, monitoring agents, logs, telemetry, Kubernetes, Docker</w:t>
+        <w:t>Apica Synthetic Monitoring, Apica Load Testing, OpenTelemetry, Grafana, Graylog,</w:t>
+      </w:r>
+      <w:r>
+        <w:t xml:space="preserve"> </w:t>
+      </w:r>
+      <w:r>
+        <w:t>ZebraTester</w:t>
+      </w:r>
+      <w:r>
+        <w:t xml:space="preserve"> </w:t>
+      </w:r>
+      <w:r>
+        <w:t>(synthetic monitoring tool)</w:t>
+      </w:r>
+      <w:r>
+        <w:t>, Selenium IDE, monitoring agents, logs, telemetry, Kubernetes, Docker</w:t>
       </w:r>
       <w:r>
         <w:br/>
@@ -540,13 +558,13 @@
         <w:pStyle w:val="ListBullet"/>
         <w:rPr>
           <w:sz w:val="20"/>
-          <w:szCs w:val="24"/>
+          <w:szCs w:val="20"/>
         </w:rPr>
       </w:pPr>
       <w:r>
         <w:rPr>
           <w:sz w:val="20"/>
-          <w:szCs w:val="24"/>
+          <w:szCs w:val="20"/>
         </w:rPr>
         <w:t>Built and maintained production WordPress and WooCommerce systems combining backend business logic, integrations, and customer-facing functionality.</w:t>
       </w:r>
@@ -556,13 +574,13 @@
         <w:pStyle w:val="ListBullet"/>
         <w:rPr>
           <w:sz w:val="20"/>
-          <w:szCs w:val="24"/>
+          <w:szCs w:val="20"/>
         </w:rPr>
       </w:pPr>
       <w:r>
         <w:rPr>
           <w:sz w:val="20"/>
-          <w:szCs w:val="24"/>
+          <w:szCs w:val="20"/>
         </w:rPr>
         <w:t>Architected and maintained a commercial WooCommerce extension for subscription changes and box configuration, owning business logic, debugging, testing, and release validation across live environments.</w:t>
       </w:r>
@@ -572,13 +590,13 @@
         <w:pStyle w:val="ListBullet"/>
         <w:rPr>
           <w:sz w:val="20"/>
-          <w:szCs w:val="24"/>
+          <w:szCs w:val="20"/>
         </w:rPr>
       </w:pPr>
       <w:r>
         <w:rPr>
           <w:sz w:val="20"/>
-          <w:szCs w:val="24"/>
+          <w:szCs w:val="20"/>
         </w:rPr>
         <w:t>Managed DNS, SSL/TLS, updates, caching, and performance optimization across hosted production systems.</w:t>
       </w:r>
@@ -588,13 +606,13 @@
         <w:pStyle w:val="ListBullet"/>
         <w:rPr>
           <w:sz w:val="20"/>
-          <w:szCs w:val="24"/>
+          <w:szCs w:val="20"/>
         </w:rPr>
       </w:pPr>
       <w:r>
         <w:rPr>
           <w:sz w:val="20"/>
-          <w:szCs w:val="24"/>
+          <w:szCs w:val="20"/>
         </w:rPr>
         <w:t>Wrote technical documentation and trained clients so they could maintain and operate systems after handoff.</w:t>
       </w:r>
@@ -603,23 +621,18 @@
       <w:pPr>
         <w:pStyle w:val="ListBullet"/>
         <w:rPr>
+          <w:b/>
+          <w:bCs/>
           <w:sz w:val="20"/>
-          <w:szCs w:val="24"/>
-        </w:rPr>
-      </w:pPr>
-      <w:r>
-        <w:t xml:space="preserve">Diagnosed and resolved </w:t>
-      </w:r>
-      <w:r>
-        <w:rPr>
-          <w:rStyle w:val="Strong"/>
-          <w:b w:val="0"/>
-          <w:bCs w:val="0"/>
-        </w:rPr>
-        <w:t>WordPress/WooCommerce database performance issues</w:t>
-      </w:r>
-      <w:r>
-        <w:t xml:space="preserve"> by analyzing telemetry, identifying high-volume Action Scheduler queries, and implementing targeted cleanup, restoring site performance and stability.</w:t>
+          <w:szCs w:val="20"/>
+        </w:rPr>
+      </w:pPr>
+      <w:r>
+        <w:rPr>
+          <w:sz w:val="20"/>
+          <w:szCs w:val="20"/>
+        </w:rPr>
+        <w:t>Resolved a critical-priority website slowness issue, reviewing hosting telemetry, PHP logs, WP-CLI output, and database activity to resolve an issue which throttled CPU usage by 50% on the hosting server.</w:t>
       </w:r>
     </w:p>
     <w:p>
@@ -939,7 +952,28 @@
           <w:sz w:val="20"/>
           <w:szCs w:val="24"/>
         </w:rPr>
-        <w:t>Completed billable customer projects in ZebraTester, Java, and Node.js, including a Node.js application that utilized $11K in prepaid Professional Services revenue within four months.</w:t>
+        <w:t xml:space="preserve">Completed billable customer projects </w:t>
+      </w:r>
+      <w:r>
+        <w:rPr>
+          <w:sz w:val="20"/>
+          <w:szCs w:val="24"/>
+        </w:rPr>
+        <w:t xml:space="preserve">using </w:t>
+      </w:r>
+      <w:r>
+        <w:rPr>
+          <w:sz w:val="20"/>
+          <w:szCs w:val="24"/>
+        </w:rPr>
+        <w:t>ZebraTester</w:t>
+      </w:r>
+      <w:r>
+        <w:rPr>
+          <w:sz w:val="20"/>
+          <w:szCs w:val="24"/>
+        </w:rPr>
+        <w:t>, Java, and Node.js, including a Node.js application that utilized $11K in prepaid Professional Services revenue within four months.</w:t>
       </w:r>
     </w:p>
     <w:p>
@@ -1333,6 +1367,7 @@
       </w:pPr>
       <w:r>
         <w:rPr>
+          <w:sz w:val="20"/>
           <w:szCs w:val="20"/>
         </w:rPr>
         <w:t>Configured and deployed Windows and Linux virtual machines in Amazon EC2, including security groups, load balancer target groups, and environment-specific network settings.</w:t>
@@ -1444,14 +1479,7 @@
           <w:sz w:val="20"/>
           <w:szCs w:val="20"/>
         </w:rPr>
-        <w:t>C</w:t>
-      </w:r>
-      <w:r>
-        <w:rPr>
-          <w:sz w:val="20"/>
-          <w:szCs w:val="20"/>
-        </w:rPr>
-        <w:t>ollaborated between internal Engineering teams and customers using Slack, Zendesk, and E-mail.</w:t>
+        <w:t>Collaborated between internal Engineering teams and customers using Slack, Zendesk, and E-mail.</w:t>
       </w:r>
     </w:p>
     <w:p>
@@ -1512,21 +1540,12 @@
           <w:lang w:val="en-IN"/>
         </w:rPr>
       </w:pPr>
-      <w:proofErr w:type="spellStart"/>
       <w:r>
         <w:rPr>
           <w:sz w:val="20"/>
           <w:szCs w:val="24"/>
         </w:rPr>
-        <w:t>Develope</w:t>
-      </w:r>
-      <w:proofErr w:type="spellEnd"/>
-      <w:r>
-        <w:rPr>
-          <w:sz w:val="20"/>
-          <w:szCs w:val="24"/>
-        </w:rPr>
-        <w:t>d a Node.js application which created a custom marketing E-mail list by pulling customer data from the Zendesk API, filtering out irrelevant data, and converting it into an Excel file.</w:t>
+        <w:t>Developed a Node.js application which created a custom marketing E-mail list by pulling customer data from the Zendesk API, filtering out irrelevant data, and converting it into an Excel file.</w:t>
       </w:r>
     </w:p>
     <w:p>
@@ -1544,6 +1563,50 @@
           <w:szCs w:val="20"/>
         </w:rPr>
         <w:t>Used Grafana to visualize Apica observability metrics and help customers interpret telemetry data.</w:t>
+      </w:r>
+    </w:p>
+    <w:p>
+      <w:pPr>
+        <w:pStyle w:val="ListBullet"/>
+        <w:rPr>
+          <w:sz w:val="20"/>
+          <w:szCs w:val="20"/>
+        </w:rPr>
+      </w:pPr>
+      <w:r>
+        <w:rPr>
+          <w:sz w:val="20"/>
+          <w:szCs w:val="20"/>
+        </w:rPr>
+        <w:t>Supported the customer-facing rollout</w:t>
+      </w:r>
+      <w:r>
+        <w:rPr>
+          <w:sz w:val="20"/>
+          <w:szCs w:val="20"/>
+        </w:rPr>
+        <w:t xml:space="preserve"> of Apica’s 2021 Log4Shell</w:t>
+      </w:r>
+      <w:r>
+        <w:rPr>
+          <w:sz w:val="20"/>
+          <w:szCs w:val="20"/>
+        </w:rPr>
+        <w:t xml:space="preserve"> vulnerability patches, coordinating between Engineering and customer teams, communicating remediation steps, and </w:t>
+      </w:r>
+      <w:r>
+        <w:rPr>
+          <w:sz w:val="20"/>
+          <w:szCs w:val="20"/>
+        </w:rPr>
+        <w:t>patching Apica products</w:t>
+      </w:r>
+      <w:r>
+        <w:rPr>
+          <w:sz w:val="20"/>
+          <w:szCs w:val="20"/>
+        </w:rPr>
+        <w:t xml:space="preserve"> in customer environments when needed.</w:t>
       </w:r>
     </w:p>
     <w:p>
@@ -4566,6 +4629,7 @@
   <w:style w:type="character" w:default="1" w:styleId="DefaultParagraphFont">
     <w:name w:val="Default Paragraph Font"/>
     <w:uiPriority w:val="1"/>
+    <w:semiHidden/>
     <w:unhideWhenUsed/>
   </w:style>
   <w:style w:type="table" w:default="1" w:styleId="TableNormal">

</xml_diff>

<commit_message>
add option to potentially include subscription everything link
</commit_message>
<xml_diff>
--- a/Caleb Miller Master Resume.docx
+++ b/Caleb Miller Master Resume.docx
@@ -188,6 +188,16 @@
           <w:bCs/>
         </w:rPr>
         <w:t xml:space="preserve">Development &amp; Integration: </w:t>
+      </w:r>
+      <w:r>
+        <w:t>Python,</w:t>
+      </w:r>
+      <w:r>
+        <w:rPr>
+          <w:b/>
+          <w:bCs/>
+        </w:rPr>
+        <w:t xml:space="preserve"> </w:t>
       </w:r>
       <w:r>
         <w:t>JavaScript, Node.js, Java, PHP, C#, SQL, REST APIs, Postman, Git, WordPress, WooCommerce, HTML, CSS/SASS</w:t>

</xml_diff>